<commit_message>
Capability statement: add the DOH vaccine reporting project
Replaces the Square Feet entry with the 2020 Hawaiʻi Department of
Health COVID-19 vaccine reporting pipeline and leads past performance
with it. Tightens spacing so the page still fits on one sheet.

Co-Authored-By: Claude Fable 5.1 <noreply@anthropic.com>
</commit_message>
<xml_diff>
--- a/capability-statement/Windward Apps Capability Statement.docx
+++ b/capability-statement/Windward Apps Capability Statement.docx
@@ -150,7 +150,7 @@
     </w:p>
     <w:p>
       <w:pPr>
-        <w:spacing w:after="120" w:line="264"/>
+        <w:spacing w:after="100" w:line="252"/>
       </w:pPr>
       <w:r>
         <w:rPr>
@@ -201,7 +201,7 @@
               <w:pBdr>
                 <w:bottom w:val="single" w:color="176FB3" w:sz="6" w:space="2"/>
               </w:pBdr>
-              <w:spacing w:before="200" w:after="80"/>
+              <w:spacing w:before="160" w:after="80"/>
             </w:pPr>
             <w:r>
               <w:rPr>
@@ -223,7 +223,7 @@
                 <w:ilvl w:val="0"/>
                 <w:numId w:val="2"/>
               </w:numPr>
-              <w:spacing w:after="60" w:line="252"/>
+              <w:spacing w:after="40" w:line="240"/>
             </w:pPr>
             <w:r>
               <w:rPr>
@@ -243,7 +243,7 @@
                 <w:sz w:val="18"/>
                 <w:szCs w:val="18"/>
               </w:rPr>
-              <w:t xml:space="preserve">Public portals, case and workflow management, field data collection, internal tools, and the integrations that tie them together. Web first; native iOS and Android when hardware access or offline use requires it.</w:t>
+              <w:t xml:space="preserve">Public portals, case and workflow management, field data collection, internal tools, and the integrations between them. Web first; native iOS and Android when needed.</w:t>
             </w:r>
           </w:p>
           <w:p>
@@ -253,7 +253,7 @@
                 <w:ilvl w:val="0"/>
                 <w:numId w:val="2"/>
               </w:numPr>
-              <w:spacing w:after="60" w:line="252"/>
+              <w:spacing w:after="40" w:line="240"/>
             </w:pPr>
             <w:r>
               <w:rPr>
@@ -283,7 +283,7 @@
                 <w:ilvl w:val="0"/>
                 <w:numId w:val="2"/>
               </w:numPr>
-              <w:spacing w:after="60" w:line="252"/>
+              <w:spacing w:after="40" w:line="240"/>
             </w:pPr>
             <w:r>
               <w:rPr>
@@ -313,7 +313,7 @@
                 <w:ilvl w:val="0"/>
                 <w:numId w:val="2"/>
               </w:numPr>
-              <w:spacing w:after="60" w:line="252"/>
+              <w:spacing w:after="40" w:line="240"/>
             </w:pPr>
             <w:r>
               <w:rPr>
@@ -333,7 +333,7 @@
                 <w:sz w:val="18"/>
                 <w:szCs w:val="18"/>
               </w:rPr>
-              <w:t xml:space="preserve">Document intake, summarization and search across agency records; MCP servers that let an assistant act on the tools staff already use. Access controls and audit trails are part of the build.</w:t>
+              <w:t xml:space="preserve">Document intake, summarization and search across agency records; MCP servers that let an assistant act on existing tools. Access controls and audit trails included.</w:t>
             </w:r>
           </w:p>
           <w:p>
@@ -343,7 +343,7 @@
                 <w:ilvl w:val="0"/>
                 <w:numId w:val="2"/>
               </w:numPr>
-              <w:spacing w:after="60" w:line="252"/>
+              <w:spacing w:after="40" w:line="240"/>
             </w:pPr>
             <w:r>
               <w:rPr>
@@ -373,7 +373,7 @@
                 <w:ilvl w:val="0"/>
                 <w:numId w:val="2"/>
               </w:numPr>
-              <w:spacing w:after="60" w:line="252"/>
+              <w:spacing w:after="40" w:line="240"/>
             </w:pPr>
             <w:r>
               <w:rPr>
@@ -393,7 +393,7 @@
                 <w:sz w:val="18"/>
                 <w:szCs w:val="18"/>
               </w:rPr>
-              <w:t xml:space="preserve">Geographic information systems, desktop software, and embedded devices.</w:t>
+              <w:t xml:space="preserve">Geographic information systems, desktop software, embedded devices.</w:t>
             </w:r>
           </w:p>
           <w:p>
@@ -401,7 +401,7 @@
               <w:pBdr>
                 <w:bottom w:val="single" w:color="176FB3" w:sz="6" w:space="2"/>
               </w:pBdr>
-              <w:spacing w:before="200" w:after="80"/>
+              <w:spacing w:before="160" w:after="80"/>
             </w:pPr>
             <w:r>
               <w:rPr>
@@ -423,7 +423,7 @@
                 <w:ilvl w:val="0"/>
                 <w:numId w:val="2"/>
               </w:numPr>
-              <w:spacing w:after="60" w:line="252"/>
+              <w:spacing w:after="40" w:line="240"/>
             </w:pPr>
             <w:r>
               <w:rPr>
@@ -453,7 +453,7 @@
                 <w:ilvl w:val="0"/>
                 <w:numId w:val="2"/>
               </w:numPr>
-              <w:spacing w:after="60" w:line="252"/>
+              <w:spacing w:after="40" w:line="240"/>
             </w:pPr>
             <w:r>
               <w:rPr>
@@ -483,7 +483,7 @@
                 <w:ilvl w:val="0"/>
                 <w:numId w:val="2"/>
               </w:numPr>
-              <w:spacing w:after="60" w:line="252"/>
+              <w:spacing w:after="40" w:line="240"/>
             </w:pPr>
             <w:r>
               <w:rPr>
@@ -513,7 +513,7 @@
                 <w:ilvl w:val="0"/>
                 <w:numId w:val="2"/>
               </w:numPr>
-              <w:spacing w:after="60" w:line="252"/>
+              <w:spacing w:after="40" w:line="240"/>
             </w:pPr>
             <w:r>
               <w:rPr>
@@ -543,7 +543,7 @@
                 <w:ilvl w:val="0"/>
                 <w:numId w:val="2"/>
               </w:numPr>
-              <w:spacing w:after="60" w:line="252"/>
+              <w:spacing w:after="40" w:line="240"/>
             </w:pPr>
             <w:r>
               <w:rPr>
@@ -573,7 +573,7 @@
                 <w:ilvl w:val="0"/>
                 <w:numId w:val="2"/>
               </w:numPr>
-              <w:spacing w:after="60" w:line="252"/>
+              <w:spacing w:after="40" w:line="240"/>
             </w:pPr>
             <w:r>
               <w:rPr>
@@ -601,7 +601,7 @@
               <w:pBdr>
                 <w:bottom w:val="single" w:color="176FB3" w:sz="6" w:space="2"/>
               </w:pBdr>
-              <w:spacing w:before="200" w:after="80"/>
+              <w:spacing w:before="160" w:after="80"/>
             </w:pPr>
             <w:r>
               <w:rPr>
@@ -629,6 +629,59 @@
                 <w:sz w:val="18"/>
                 <w:szCs w:val="18"/>
               </w:rPr>
+              <w:t xml:space="preserve">Hawaiʻi Department of Health</w:t>
+            </w:r>
+            <w:r>
+              <w:rPr>
+                <w:rFonts w:ascii="Arial" w:cs="Arial" w:eastAsia="Arial" w:hAnsi="Arial"/>
+                <w:color w:val="5F6C80"/>
+                <w:sz w:val="18"/>
+                <w:szCs w:val="18"/>
+              </w:rPr>
+              <w:t xml:space="preserve">  ·  COVID-19 vaccine reporting pipeline</w:t>
+            </w:r>
+          </w:p>
+          <w:p>
+            <w:pPr>
+              <w:spacing w:after="20" w:line="240"/>
+            </w:pPr>
+            <w:r>
+              <w:rPr>
+                <w:rFonts w:ascii="Arial" w:cs="Arial" w:eastAsia="Arial" w:hAnsi="Arial"/>
+                <w:color w:val="2C3A50"/>
+                <w:sz w:val="18"/>
+                <w:szCs w:val="18"/>
+              </w:rPr>
+              <w:t xml:space="preserve">With the first vaccine shipments en route in late 2020 and the state immunization registry offline, the CDC required every vaccination event reported before approving further shipments. Working with DOH, the State Epidemiologist and the CDC, designed and built the ETL tool that pulled records from CDC’s VAMS and produced the daily datasets CDC required. Six months through handoff, as subcontractor to Hawaiʻi Data Collaborative.</w:t>
+            </w:r>
+          </w:p>
+          <w:p>
+            <w:pPr>
+              <w:spacing w:after="80"/>
+            </w:pPr>
+            <w:r>
+              <w:rPr>
+                <w:rFonts w:ascii="Arial" w:cs="Arial" w:eastAsia="Arial" w:hAnsi="Arial"/>
+                <w:color w:val="5F6C80"/>
+                <w:sz w:val="15"/>
+                <w:szCs w:val="15"/>
+              </w:rPr>
+              <w:t xml:space="preserve">Reference: Hawaiʻi Data Collaborative; contact details on request</w:t>
+            </w:r>
+          </w:p>
+          <w:p>
+            <w:pPr>
+              <w:spacing w:before="60" w:after="20"/>
+            </w:pPr>
+            <w:r>
+              <w:rPr>
+                <w:rFonts w:ascii="Arial" w:cs="Arial" w:eastAsia="Arial" w:hAnsi="Arial"/>
+                <w:b/>
+                <w:bCs/>
+                <w:color w:val="15243D"/>
+                <w:sz w:val="18"/>
+                <w:szCs w:val="18"/>
+              </w:rPr>
               <w:t xml:space="preserve">Hawaiʻi Commission on Water Resource Management</w:t>
             </w:r>
             <w:r>
@@ -643,7 +696,7 @@
           </w:p>
           <w:p>
             <w:pPr>
-              <w:spacing w:after="20" w:line="252"/>
+              <w:spacing w:after="20" w:line="240"/>
             </w:pPr>
             <w:r>
               <w:rPr>
@@ -663,8 +716,8 @@
               <w:rPr>
                 <w:rFonts w:ascii="Arial" w:cs="Arial" w:eastAsia="Arial" w:hAnsi="Arial"/>
                 <w:color w:val="5F6C80"/>
-                <w:sz w:val="16"/>
-                <w:szCs w:val="16"/>
+                <w:sz w:val="15"/>
+                <w:szCs w:val="15"/>
               </w:rPr>
               <w:t xml:space="preserve">Reference: Roy Hardy, roy.hardy@hawaii.gov</w:t>
             </w:r>
@@ -696,7 +749,7 @@
           </w:p>
           <w:p>
             <w:pPr>
-              <w:spacing w:after="20" w:line="252"/>
+              <w:spacing w:after="20" w:line="240"/>
             </w:pPr>
             <w:r>
               <w:rPr>
@@ -716,63 +769,10 @@
               <w:rPr>
                 <w:rFonts w:ascii="Arial" w:cs="Arial" w:eastAsia="Arial" w:hAnsi="Arial"/>
                 <w:color w:val="5F6C80"/>
-                <w:sz w:val="16"/>
-                <w:szCs w:val="16"/>
+                <w:sz w:val="15"/>
+                <w:szCs w:val="15"/>
               </w:rPr>
               <w:t xml:space="preserve">Reference: Trevor Williams, trevorwilliamsatx@gmail.com</w:t>
-            </w:r>
-          </w:p>
-          <w:p>
-            <w:pPr>
-              <w:spacing w:before="60" w:after="20"/>
-            </w:pPr>
-            <w:r>
-              <w:rPr>
-                <w:rFonts w:ascii="Arial" w:cs="Arial" w:eastAsia="Arial" w:hAnsi="Arial"/>
-                <w:b/>
-                <w:bCs/>
-                <w:color w:val="15243D"/>
-                <w:sz w:val="18"/>
-                <w:szCs w:val="18"/>
-              </w:rPr>
-              <w:t xml:space="preserve">Square Feet Hawaiʻi</w:t>
-            </w:r>
-            <w:r>
-              <w:rPr>
-                <w:rFonts w:ascii="Arial" w:cs="Arial" w:eastAsia="Arial" w:hAnsi="Arial"/>
-                <w:color w:val="5F6C80"/>
-                <w:sz w:val="18"/>
-                <w:szCs w:val="18"/>
-              </w:rPr>
-              <w:t xml:space="preserve">  ·  Real estate platform</w:t>
-            </w:r>
-          </w:p>
-          <w:p>
-            <w:pPr>
-              <w:spacing w:after="20" w:line="252"/>
-            </w:pPr>
-            <w:r>
-              <w:rPr>
-                <w:rFonts w:ascii="Arial" w:cs="Arial" w:eastAsia="Arial" w:hAnsi="Arial"/>
-                <w:color w:val="2C3A50"/>
-                <w:sz w:val="18"/>
-                <w:szCs w:val="18"/>
-              </w:rPr>
-              <w:t xml:space="preserve">Web platform for buying and selling property: listings and search, agent-to-client messaging, and agent note-taking in one system. Built to launch readiness before the venture closed.</w:t>
-            </w:r>
-          </w:p>
-          <w:p>
-            <w:pPr>
-              <w:spacing w:after="80"/>
-            </w:pPr>
-            <w:r>
-              <w:rPr>
-                <w:rFonts w:ascii="Arial" w:cs="Arial" w:eastAsia="Arial" w:hAnsi="Arial"/>
-                <w:color w:val="5F6C80"/>
-                <w:sz w:val="16"/>
-                <w:szCs w:val="16"/>
-              </w:rPr>
-              <w:t xml:space="preserve">Reference: Luke, luke@squarefeethawaii.com</w:t>
             </w:r>
           </w:p>
         </w:tc>
@@ -1512,7 +1512,7 @@
     <w:sectPr>
       <w:footerReference w:type="default" r:id="rId6"/>
       <w:pgSz w:w="12240" w:h="15840" w:orient="portrait"/>
-      <w:pgMar w:top="864" w:right="1008" w:bottom="720" w:left="1008" w:header="708" w:footer="400" w:gutter="0"/>
+      <w:pgMar w:top="720" w:right="1008" w:bottom="620" w:left="1008" w:header="708" w:footer="400" w:gutter="0"/>
       <w:pgNumType/>
       <w:docGrid w:linePitch="360"/>
     </w:sectPr>

</xml_diff>

<commit_message>
Replace VetCert with SBA Certifications
SBA's VetCert program has moved to SBA Certifications
(certifications.sba.gov). Update the vendor profile wording and link,
and the capability statement badge and status line, then regenerate
the docx and PDF.

Co-Authored-By: Claude Opus 5.5 <noreply@anthropic.com>
</commit_message>
<xml_diff>
--- a/capability-statement/Windward Apps Capability Statement.docx
+++ b/capability-statement/Windward Apps Capability Statement.docx
@@ -126,7 +126,7 @@
                 <w:sz w:val="16"/>
                 <w:szCs w:val="16"/>
               </w:rPr>
-              <w:t xml:space="preserve">SDVOSB  ·  SBA VetCert certified</w:t>
+              <w:t xml:space="preserve">SDVOSB  ·  SBA certified</w:t>
             </w:r>
           </w:p>
         </w:tc>
@@ -939,7 +939,7 @@
                 <w:sz w:val="17"/>
                 <w:szCs w:val="17"/>
               </w:rPr>
-              <w:t xml:space="preserve">SDVOSB, SBA VetCert certified</w:t>
+              <w:t xml:space="preserve">SDVOSB, SBA certified</w:t>
             </w:r>
           </w:p>
           <w:p>

</xml_diff>

<commit_message>
Lead with AI integration and reword custom applications
Capability statement: shorten the Department of Health past
performance entry, move AI integration up to second in the overview
and core competencies, and replace the custom applications list with
a single range from major organizational systems to startup platforms.

Website: carry the same custom applications wording to the services
page and home page card, move AI integration to second on both, and
add it to the about page's list of what we build.

Co-Authored-By: Claude Opus 5.5 <noreply@anthropic.com>
</commit_message>
<xml_diff>
--- a/capability-statement/Windward Apps Capability Statement.docx
+++ b/capability-statement/Windward Apps Capability Statement.docx
@@ -159,7 +159,7 @@
           <w:sz w:val="18"/>
           <w:szCs w:val="18"/>
         </w:rPr>
-        <w:t xml:space="preserve">Windward Apps is a service-disabled veteran-owned software consultancy in Kailua, Hawaiʻi. We build and modernize the systems agencies actually run on: custom applications, public portals, data pipelines, automation, and AI integration. Our engineers direct AI agents that write, test and refactor code, and a senior engineer reviews every line before it ships. That is how a small team delivers enterprise-scale work in months instead of years, at a fraction of the traditional cost.</w:t>
+        <w:t xml:space="preserve">Windward Apps is a service-disabled veteran-owned software consultancy in Kailua, Hawaiʻi. We build and modernize the systems agencies actually run on: custom applications, AI integration, public portals, data pipelines, and automation. Our engineers direct AI agents that write, test and refactor code, and a senior engineer reviews every line before it ships. That is how a small team delivers enterprise-scale work in months instead of years, at a fraction of the traditional cost.</w:t>
       </w:r>
     </w:p>
     <w:tbl>
@@ -243,7 +243,7 @@
                 <w:sz w:val="18"/>
                 <w:szCs w:val="18"/>
               </w:rPr>
-              <w:t xml:space="preserve">Public portals, case and workflow management, field data collection, internal tools, and the integrations between them. Web first; native iOS and Android when needed.</w:t>
+              <w:t xml:space="preserve">Web and mobile applications built around how people actually work, from major organizational systems to startup platforms and internal tools, connected to what is already in place.</w:t>
             </w:r>
           </w:p>
           <w:p>
@@ -264,16 +264,16 @@
                 <w:sz w:val="18"/>
                 <w:szCs w:val="18"/>
               </w:rPr>
-              <w:t xml:space="preserve">Modernization and automation. </w:t>
-            </w:r>
-            <w:r>
-              <w:rPr>
-                <w:rFonts w:ascii="Arial" w:cs="Arial" w:eastAsia="Arial" w:hAnsi="Arial"/>
-                <w:color w:val="2C3A50"/>
-                <w:sz w:val="18"/>
-                <w:szCs w:val="18"/>
-              </w:rPr>
-              <w:t xml:space="preserve">Incremental replacement of paper, fax, spreadsheet and legacy processes, with data kept intact and hand-offs automated.</w:t>
+              <w:t xml:space="preserve">AI integration. </w:t>
+            </w:r>
+            <w:r>
+              <w:rPr>
+                <w:rFonts w:ascii="Arial" w:cs="Arial" w:eastAsia="Arial" w:hAnsi="Arial"/>
+                <w:color w:val="2C3A50"/>
+                <w:sz w:val="18"/>
+                <w:szCs w:val="18"/>
+              </w:rPr>
+              <w:t xml:space="preserve">Document intake, summarization and search across agency records; MCP servers that let an assistant act on existing tools. Access controls and audit trails included.</w:t>
             </w:r>
           </w:p>
           <w:p>
@@ -294,16 +294,16 @@
                 <w:sz w:val="18"/>
                 <w:szCs w:val="18"/>
               </w:rPr>
-              <w:t xml:space="preserve">Data and reporting. </w:t>
-            </w:r>
-            <w:r>
-              <w:rPr>
-                <w:rFonts w:ascii="Arial" w:cs="Arial" w:eastAsia="Arial" w:hAnsi="Arial"/>
-                <w:color w:val="2C3A50"/>
-                <w:sz w:val="18"/>
-                <w:szCs w:val="18"/>
-              </w:rPr>
-              <w:t xml:space="preserve">Pipelines that pull from existing systems into one source of truth, feeding dashboards and required reporting automatically.</w:t>
+              <w:t xml:space="preserve">Modernization and automation. </w:t>
+            </w:r>
+            <w:r>
+              <w:rPr>
+                <w:rFonts w:ascii="Arial" w:cs="Arial" w:eastAsia="Arial" w:hAnsi="Arial"/>
+                <w:color w:val="2C3A50"/>
+                <w:sz w:val="18"/>
+                <w:szCs w:val="18"/>
+              </w:rPr>
+              <w:t xml:space="preserve">Incremental replacement of paper, fax, spreadsheet and legacy processes, with data kept intact and hand-offs automated.</w:t>
             </w:r>
           </w:p>
           <w:p>
@@ -324,16 +324,16 @@
                 <w:sz w:val="18"/>
                 <w:szCs w:val="18"/>
               </w:rPr>
-              <w:t xml:space="preserve">AI integration. </w:t>
-            </w:r>
-            <w:r>
-              <w:rPr>
-                <w:rFonts w:ascii="Arial" w:cs="Arial" w:eastAsia="Arial" w:hAnsi="Arial"/>
-                <w:color w:val="2C3A50"/>
-                <w:sz w:val="18"/>
-                <w:szCs w:val="18"/>
-              </w:rPr>
-              <w:t xml:space="preserve">Document intake, summarization and search across agency records; MCP servers that let an assistant act on existing tools. Access controls and audit trails included.</w:t>
+              <w:t xml:space="preserve">Data and reporting. </w:t>
+            </w:r>
+            <w:r>
+              <w:rPr>
+                <w:rFonts w:ascii="Arial" w:cs="Arial" w:eastAsia="Arial" w:hAnsi="Arial"/>
+                <w:color w:val="2C3A50"/>
+                <w:sz w:val="18"/>
+                <w:szCs w:val="18"/>
+              </w:rPr>
+              <w:t xml:space="preserve">Pipelines that pull from existing systems into one source of truth, feeding dashboards and required reporting automatically.</w:t>
             </w:r>
           </w:p>
           <w:p>
@@ -652,7 +652,7 @@
                 <w:sz w:val="18"/>
                 <w:szCs w:val="18"/>
               </w:rPr>
-              <w:t xml:space="preserve">With the first vaccine shipments en route in late 2020 and the state immunization registry offline, the CDC required every vaccination event reported before approving further shipments. Working with DOH, the State Epidemiologist and the CDC, designed and built the ETL tool that pulled records from CDC’s VAMS and produced the daily datasets CDC required. Six months through handoff, as subcontractor to Hawaiʻi Data Collaborative.</w:t>
+              <w:t xml:space="preserve">Built the pipeline that turned CDC VAMS records into the daily vaccination reports CDC required before releasing more vaccine to Hawaiʻi in late 2020. Six months with DOH, the State Epidemiologist and CDC, as subcontractor to Hawaiʻi Data Collaborative.</w:t>
             </w:r>
           </w:p>
           <w:p>

</xml_diff>